<commit_message>
Bump VERSION sw.js : grille PPSPS v5 + correctifs
</commit_message>
<xml_diff>
--- a/complet/modeles/CR_Visite_Chantier_CSPS17_v2.docx
+++ b/complet/modeles/CR_Visite_Chantier_CSPS17_v2.docx
@@ -3017,6 +3017,43 @@
               <w:szCs w:val="18"/>
             </w:rPr>
             <w:t>Alain SUZANNE | 07 81 08 30 54 | coordo17sps@gmail.com</w:t>
+          </w:r>
+        </w:p>
+      </w:tc>
+    </w:tr>
+    <w:tr>
+      <w:tc>
+        <w:tcPr>
+          <w:tcW w:w="2000" w:type="dxa"/>
+          <w:tcBorders>
+            <w:top w:val="none" w:sz="0" w:space="0" w:color="FFFFFF"/>
+            <w:left w:val="none" w:sz="0" w:space="0" w:color="FFFFFF"/>
+            <w:bottom w:val="none" w:sz="0" w:space="0" w:color="FFFFFF"/>
+            <w:right w:val="none" w:sz="0" w:space="0" w:color="FFFFFF"/>
+          </w:tcBorders>
+          <w:shd w:val="clear" w:color="auto" w:fill="FFFFFF"/>
+          <w:tcMar>
+            <w:top w:w="0" w:type="dxa"/>
+            <w:left w:w="60" w:type="dxa"/>
+            <w:bottom w:w="20" w:type="dxa"/>
+            <w:right w:w="60" w:type="dxa"/>
+          </w:tcMar>
+          <w:vAlign w:val="center"/>
+        </w:tcPr>
+        <w:p>
+          <w:pPr>
+            <w:jc w:val="center"/>
+            <w:bookmarkStart w:id="9001" w:name="CSPS17-VERSION"/>
+            <w:bookmarkEnd w:id="9001"/>
+          </w:pPr>
+          <w:r>
+            <w:rPr>
+              <w:rFonts w:ascii="Arial" w:eastAsia="Arial" w:hAnsi="Arial" w:cs="Arial"/>
+              <w:color w:val="999999"/>
+              <w:sz w:val="13"/>
+              <w:szCs w:val="13"/>
+            </w:rPr>
+            <w:t xml:space="preserve">v2</w:t>
           </w:r>
         </w:p>
       </w:tc>

</xml_diff>